<commit_message>
Cite videos by their full file names in the meeting prep
Source lines now give the full recording name rather than "Part N", so a
question can be traced to a specific file without knowing the shorthand.
Notes keep a short form since repeating the full name inline reads badly,
and a key at the top maps one to the other.

Co-Authored-By: Claude Opus 5 <noreply@anthropic.com>
Claude-Session: https://claude.ai/code/session_01NGLPCmZEnLwWWew5jbH6qG
</commit_message>
<xml_diff>
--- a/manuals/Payroll Handover - Meeting Prep.docx
+++ b/manuals/Payroll Handover - Meeting Prep.docx
@@ -217,6 +217,344 @@
           <w:sz w:val="28"/>
           <w:szCs w:val="28"/>
         </w:rPr>
+        <w:t xml:space="preserve">The six videos</w:t>
+      </w:r>
+    </w:p>
+    <w:p>
+      <w:pPr>
+        <w:spacing w:after="120"/>
+      </w:pPr>
+      <w:r>
+        <w:rPr>
+          <w:sz w:val="22"/>
+          <w:szCs w:val="22"/>
+        </w:rPr>
+        <w:t xml:space="preserve">Source lines below give the full file name. Where a note refers to a video in passing it uses the short form, which maps as follows:</w:t>
+      </w:r>
+    </w:p>
+    <w:tbl>
+      <w:tblPr>
+        <w:tblW w:type="auto" w:w="100"/>
+        <w:tblBorders>
+          <w:top w:val="single" w:color="auto" w:sz="4"/>
+          <w:left w:val="single" w:color="auto" w:sz="4"/>
+          <w:bottom w:val="single" w:color="auto" w:sz="4"/>
+          <w:right w:val="single" w:color="auto" w:sz="4"/>
+          <w:insideH w:val="single" w:color="auto" w:sz="4"/>
+          <w:insideV w:val="single" w:color="auto" w:sz="4"/>
+        </w:tblBorders>
+      </w:tblPr>
+      <w:tblGrid>
+        <w:gridCol w:w="2900"/>
+        <w:gridCol w:w="6460"/>
+      </w:tblGrid>
+      <w:tr>
+        <w:tc>
+          <w:tcPr>
+            <w:tcW w:type="dxa" w:w="2900"/>
+            <w:shd w:fill="F7F9FC" w:val="clear"/>
+            <w:tcMar>
+              <w:top w:type="dxa" w:w="80"/>
+              <w:left w:type="dxa" w:w="140"/>
+              <w:bottom w:type="dxa" w:w="80"/>
+              <w:right w:type="dxa" w:w="140"/>
+            </w:tcMar>
+          </w:tcPr>
+          <w:p>
+            <w:r>
+              <w:rPr>
+                <w:b/>
+                <w:bCs/>
+                <w:sz w:val="20"/>
+                <w:szCs w:val="20"/>
+              </w:rPr>
+              <w:t xml:space="preserve">Video 1</w:t>
+            </w:r>
+          </w:p>
+        </w:tc>
+        <w:tc>
+          <w:tcPr>
+            <w:tcW w:type="dxa" w:w="6460"/>
+            <w:shd w:fill="F7F9FC" w:val="clear"/>
+            <w:tcMar>
+              <w:top w:type="dxa" w:w="80"/>
+              <w:left w:type="dxa" w:w="140"/>
+              <w:bottom w:type="dxa" w:w="80"/>
+              <w:right w:type="dxa" w:w="140"/>
+            </w:tcMar>
+          </w:tcPr>
+          <w:p>
+            <w:r>
+              <w:rPr>
+                <w:b w:val="false"/>
+                <w:bCs w:val="false"/>
+                <w:sz w:val="20"/>
+                <w:szCs w:val="20"/>
+              </w:rPr>
+              <w:t xml:space="preserve">Payroll Processing Part 1 (Payroll Prep)</w:t>
+            </w:r>
+          </w:p>
+        </w:tc>
+      </w:tr>
+      <w:tr>
+        <w:tc>
+          <w:tcPr>
+            <w:tcW w:type="dxa" w:w="2900"/>
+            <w:shd w:fill="FFFFFF" w:val="clear"/>
+            <w:tcMar>
+              <w:top w:type="dxa" w:w="80"/>
+              <w:left w:type="dxa" w:w="140"/>
+              <w:bottom w:type="dxa" w:w="80"/>
+              <w:right w:type="dxa" w:w="140"/>
+            </w:tcMar>
+          </w:tcPr>
+          <w:p>
+            <w:r>
+              <w:rPr>
+                <w:b/>
+                <w:bCs/>
+                <w:sz w:val="20"/>
+                <w:szCs w:val="20"/>
+              </w:rPr>
+              <w:t xml:space="preserve">Video 2</w:t>
+            </w:r>
+          </w:p>
+        </w:tc>
+        <w:tc>
+          <w:tcPr>
+            <w:tcW w:type="dxa" w:w="6460"/>
+            <w:shd w:fill="FFFFFF" w:val="clear"/>
+            <w:tcMar>
+              <w:top w:type="dxa" w:w="80"/>
+              <w:left w:type="dxa" w:w="140"/>
+              <w:bottom w:type="dxa" w:w="80"/>
+              <w:right w:type="dxa" w:w="140"/>
+            </w:tcMar>
+          </w:tcPr>
+          <w:p>
+            <w:r>
+              <w:rPr>
+                <w:b w:val="false"/>
+                <w:bCs w:val="false"/>
+                <w:sz w:val="20"/>
+                <w:szCs w:val="20"/>
+              </w:rPr>
+              <w:t xml:space="preserve">Payroll Processing Part 2 (Creating New Pay Run)</w:t>
+            </w:r>
+          </w:p>
+        </w:tc>
+      </w:tr>
+      <w:tr>
+        <w:tc>
+          <w:tcPr>
+            <w:tcW w:type="dxa" w:w="2900"/>
+            <w:shd w:fill="F7F9FC" w:val="clear"/>
+            <w:tcMar>
+              <w:top w:type="dxa" w:w="80"/>
+              <w:left w:type="dxa" w:w="140"/>
+              <w:bottom w:type="dxa" w:w="80"/>
+              <w:right w:type="dxa" w:w="140"/>
+            </w:tcMar>
+          </w:tcPr>
+          <w:p>
+            <w:r>
+              <w:rPr>
+                <w:b/>
+                <w:bCs/>
+                <w:sz w:val="20"/>
+                <w:szCs w:val="20"/>
+              </w:rPr>
+              <w:t xml:space="preserve">Video 3</w:t>
+            </w:r>
+          </w:p>
+        </w:tc>
+        <w:tc>
+          <w:tcPr>
+            <w:tcW w:type="dxa" w:w="6460"/>
+            <w:shd w:fill="F7F9FC" w:val="clear"/>
+            <w:tcMar>
+              <w:top w:type="dxa" w:w="80"/>
+              <w:left w:type="dxa" w:w="140"/>
+              <w:bottom w:type="dxa" w:w="80"/>
+              <w:right w:type="dxa" w:w="140"/>
+            </w:tcMar>
+          </w:tcPr>
+          <w:p>
+            <w:r>
+              <w:rPr>
+                <w:b w:val="false"/>
+                <w:bCs w:val="false"/>
+                <w:sz w:val="20"/>
+                <w:szCs w:val="20"/>
+              </w:rPr>
+              <w:t xml:space="preserve">Payroll Processing Part 3 (Reconciling Timesheets)</w:t>
+            </w:r>
+          </w:p>
+        </w:tc>
+      </w:tr>
+      <w:tr>
+        <w:tc>
+          <w:tcPr>
+            <w:tcW w:type="dxa" w:w="2900"/>
+            <w:shd w:fill="FFFFFF" w:val="clear"/>
+            <w:tcMar>
+              <w:top w:type="dxa" w:w="80"/>
+              <w:left w:type="dxa" w:w="140"/>
+              <w:bottom w:type="dxa" w:w="80"/>
+              <w:right w:type="dxa" w:w="140"/>
+            </w:tcMar>
+          </w:tcPr>
+          <w:p>
+            <w:r>
+              <w:rPr>
+                <w:b/>
+                <w:bCs/>
+                <w:sz w:val="20"/>
+                <w:szCs w:val="20"/>
+              </w:rPr>
+              <w:t xml:space="preserve">Video 4</w:t>
+            </w:r>
+          </w:p>
+        </w:tc>
+        <w:tc>
+          <w:tcPr>
+            <w:tcW w:type="dxa" w:w="6460"/>
+            <w:shd w:fill="FFFFFF" w:val="clear"/>
+            <w:tcMar>
+              <w:top w:type="dxa" w:w="80"/>
+              <w:left w:type="dxa" w:w="140"/>
+              <w:bottom w:type="dxa" w:w="80"/>
+              <w:right w:type="dxa" w:w="140"/>
+            </w:tcMar>
+          </w:tcPr>
+          <w:p>
+            <w:r>
+              <w:rPr>
+                <w:b w:val="false"/>
+                <w:bCs w:val="false"/>
+                <w:sz w:val="20"/>
+                <w:szCs w:val="20"/>
+              </w:rPr>
+              <w:t xml:space="preserve">Payroll Processing Part 4 (Reconciling Timesheets)</w:t>
+            </w:r>
+          </w:p>
+        </w:tc>
+      </w:tr>
+      <w:tr>
+        <w:tc>
+          <w:tcPr>
+            <w:tcW w:type="dxa" w:w="2900"/>
+            <w:shd w:fill="F7F9FC" w:val="clear"/>
+            <w:tcMar>
+              <w:top w:type="dxa" w:w="80"/>
+              <w:left w:type="dxa" w:w="140"/>
+              <w:bottom w:type="dxa" w:w="80"/>
+              <w:right w:type="dxa" w:w="140"/>
+            </w:tcMar>
+          </w:tcPr>
+          <w:p>
+            <w:r>
+              <w:rPr>
+                <w:b/>
+                <w:bCs/>
+                <w:sz w:val="20"/>
+                <w:szCs w:val="20"/>
+              </w:rPr>
+              <w:t xml:space="preserve">Video 5</w:t>
+            </w:r>
+          </w:p>
+        </w:tc>
+        <w:tc>
+          <w:tcPr>
+            <w:tcW w:type="dxa" w:w="6460"/>
+            <w:shd w:fill="F7F9FC" w:val="clear"/>
+            <w:tcMar>
+              <w:top w:type="dxa" w:w="80"/>
+              <w:left w:type="dxa" w:w="140"/>
+              <w:bottom w:type="dxa" w:w="80"/>
+              <w:right w:type="dxa" w:w="140"/>
+            </w:tcMar>
+          </w:tcPr>
+          <w:p>
+            <w:r>
+              <w:rPr>
+                <w:b w:val="false"/>
+                <w:bCs w:val="false"/>
+                <w:sz w:val="20"/>
+                <w:szCs w:val="20"/>
+              </w:rPr>
+              <w:t xml:space="preserve">Payroll Processing Part 5 (Reconciling &amp; Balancing Payrun)</w:t>
+            </w:r>
+          </w:p>
+        </w:tc>
+      </w:tr>
+      <w:tr>
+        <w:tc>
+          <w:tcPr>
+            <w:tcW w:type="dxa" w:w="2900"/>
+            <w:shd w:fill="FFFFFF" w:val="clear"/>
+            <w:tcMar>
+              <w:top w:type="dxa" w:w="80"/>
+              <w:left w:type="dxa" w:w="140"/>
+              <w:bottom w:type="dxa" w:w="80"/>
+              <w:right w:type="dxa" w:w="140"/>
+            </w:tcMar>
+          </w:tcPr>
+          <w:p>
+            <w:r>
+              <w:rPr>
+                <w:b/>
+                <w:bCs/>
+                <w:sz w:val="20"/>
+                <w:szCs w:val="20"/>
+              </w:rPr>
+              <w:t xml:space="preserve">Video 6</w:t>
+            </w:r>
+          </w:p>
+        </w:tc>
+        <w:tc>
+          <w:tcPr>
+            <w:tcW w:type="dxa" w:w="6460"/>
+            <w:shd w:fill="FFFFFF" w:val="clear"/>
+            <w:tcMar>
+              <w:top w:type="dxa" w:w="80"/>
+              <w:left w:type="dxa" w:w="140"/>
+              <w:bottom w:type="dxa" w:w="80"/>
+              <w:right w:type="dxa" w:w="140"/>
+            </w:tcMar>
+          </w:tcPr>
+          <w:p>
+            <w:r>
+              <w:rPr>
+                <w:b w:val="false"/>
+                <w:bCs w:val="false"/>
+                <w:sz w:val="20"/>
+                <w:szCs w:val="20"/>
+              </w:rPr>
+              <w:t xml:space="preserve">Payroll Processing Part 6 (Finalisation &amp; Bank Upload)</w:t>
+            </w:r>
+          </w:p>
+        </w:tc>
+      </w:tr>
+    </w:tbl>
+    <w:p>
+      <w:pPr>
+        <w:spacing w:after="200"/>
+      </w:pPr>
+    </w:p>
+    <w:p>
+      <w:pPr>
+        <w:pStyle w:val="Heading1"/>
+        <w:spacing w:after="160" w:before="360"/>
+      </w:pPr>
+      <w:r>
+        <w:rPr>
+          <w:b/>
+          <w:bCs/>
+          <w:color w:val="1F4E79"/>
+          <w:sz w:val="28"/>
+          <w:szCs w:val="28"/>
+        </w:rPr>
         <w:t xml:space="preserve">Access</w:t>
       </w:r>
     </w:p>
@@ -256,7 +594,7 @@
           <w:sz w:val="18"/>
           <w:szCs w:val="18"/>
         </w:rPr>
-        <w:t xml:space="preserve">Part 6 — Finalisation &amp; Bank Upload, at 01:52</w:t>
+        <w:t xml:space="preserve">Video: Payroll Processing Part 6 (Finalisation &amp; Bank Upload), at 01:52</w:t>
       </w:r>
     </w:p>
     <w:p>
@@ -443,7 +781,7 @@
           <w:sz w:val="18"/>
           <w:szCs w:val="18"/>
         </w:rPr>
-        <w:t xml:space="preserve">Part 6 at 00:00 and at 08:52</w:t>
+        <w:t xml:space="preserve">Video: Payroll Processing Part 6 (Finalisation &amp; Bank Upload) at 00:00 and at 08:52</w:t>
       </w:r>
     </w:p>
     <w:p>
@@ -563,7 +901,7 @@
           <w:sz w:val="18"/>
           <w:szCs w:val="18"/>
         </w:rPr>
-        <w:t xml:space="preserve">Part 1 — Payroll Prep, at 02:48</w:t>
+        <w:t xml:space="preserve">Video: Payroll Processing Part 1 (Payroll Prep), at 02:48</w:t>
       </w:r>
     </w:p>
     <w:p>
@@ -632,7 +970,7 @@
           <w:sz w:val="18"/>
           <w:szCs w:val="18"/>
         </w:rPr>
-        <w:t xml:space="preserve">Part 3 — Reconciling Timesheets, at 42:28</w:t>
+        <w:t xml:space="preserve">Video: Payroll Processing Part 3 (Reconciling Timesheets), at 42:28</w:t>
       </w:r>
     </w:p>
     <w:p>
@@ -803,7 +1141,7 @@
           <w:sz w:val="18"/>
           <w:szCs w:val="18"/>
         </w:rPr>
-        <w:t xml:space="preserve">Part 6 at 16:48, and Part 5 at 40:36</w:t>
+        <w:t xml:space="preserve">Video: Payroll Processing Part 6 (Finalisation &amp; Bank Upload) at 16:48, and Payroll Processing Part 5 (Reconciling &amp; Balancing Payrun) at 40:36</w:t>
       </w:r>
     </w:p>
     <w:p>
@@ -833,7 +1171,7 @@
           <w:sz w:val="20"/>
           <w:szCs w:val="20"/>
         </w:rPr>
-        <w:t xml:space="preserve">Employment Hero went down mid-session during Part 6, and a separate fault where rates fail to sync from HR to payroll comes up repeatedly in Part 5. Both would need a support contact if they happened to you alone.</w:t>
+        <w:t xml:space="preserve">Employment Hero went down mid-session during Video 6, and a separate fault where rates fail to sync from HR to payroll comes up repeatedly in Video 5. Both would need a support contact if they happened to you alone.</w:t>
       </w:r>
     </w:p>
     <w:p>
@@ -900,7 +1238,7 @@
           <w:sz w:val="20"/>
           <w:szCs w:val="20"/>
         </w:rPr>
-        <w:t xml:space="preserve">A resigning employee is mentioned in passing during rate verification in Part 5 — "he's the one who resigned" — but no termination is ever processed on camera.</w:t>
+        <w:t xml:space="preserve">A resigning employee is mentioned in passing during rate verification in Video 5 — "he's the one who resigned" — but no termination is ever processed on camera.</w:t>
       </w:r>
     </w:p>
     <w:p>
@@ -939,7 +1277,7 @@
           <w:sz w:val="18"/>
           <w:szCs w:val="18"/>
         </w:rPr>
-        <w:t xml:space="preserve">Part 2 — Creating a New Pay Run, at 00:56</w:t>
+        <w:t xml:space="preserve">Video: Payroll Processing Part 2 (Creating New Pay Run), at 00:56</w:t>
       </w:r>
     </w:p>
     <w:p>
@@ -1008,7 +1346,7 @@
           <w:sz w:val="18"/>
           <w:szCs w:val="18"/>
         </w:rPr>
-        <w:t xml:space="preserve">Part 3 at 41:04</w:t>
+        <w:t xml:space="preserve">Video: Payroll Processing Part 3 (Reconciling Timesheets) at 41:04</w:t>
       </w:r>
     </w:p>
     <w:p>
@@ -1077,7 +1415,7 @@
           <w:sz w:val="18"/>
           <w:szCs w:val="18"/>
         </w:rPr>
-        <w:t xml:space="preserve">Part 6, on screen at 15:58</w:t>
+        <w:t xml:space="preserve">Video: Payroll Processing Part 6 (Finalisation &amp; Bank Upload), on screen at 15:58</w:t>
       </w:r>
     </w:p>
     <w:p>
@@ -1107,7 +1445,7 @@
           <w:sz w:val="20"/>
           <w:szCs w:val="20"/>
         </w:rPr>
-        <w:t xml:space="preserve">That message appears in the finalised pay run. Part 5 shows corrections being made as back pays in the following fortnight, so that appears to be the route — but it is never stated as the rule.</w:t>
+        <w:t xml:space="preserve">That message appears in the finalised pay run. Video 5 shows corrections being made as back pays in the following fortnight, so that appears to be the route — but it is never stated as the rule.</w:t>
       </w:r>
     </w:p>
     <w:p>
@@ -1197,7 +1535,7 @@
           <w:sz w:val="18"/>
           <w:szCs w:val="18"/>
         </w:rPr>
-        <w:t xml:space="preserve">Part 5 — Reconciling &amp; Balancing, at 21:00</w:t>
+        <w:t xml:space="preserve">Video: Payroll Processing Part 5 (Reconciling &amp; Balancing Payrun), at 21:00</w:t>
       </w:r>
     </w:p>
     <w:p>
@@ -1282,7 +1620,7 @@
           <w:sz w:val="18"/>
           <w:szCs w:val="18"/>
         </w:rPr>
-        <w:t xml:space="preserve">Part 3 at 30:48</w:t>
+        <w:t xml:space="preserve">Video: Payroll Processing Part 3 (Reconciling Timesheets) at 30:48</w:t>
       </w:r>
     </w:p>
     <w:p>
@@ -1351,7 +1689,7 @@
           <w:sz w:val="18"/>
           <w:szCs w:val="18"/>
         </w:rPr>
-        <w:t xml:space="preserve">Part 3 at 39:12, 39:40 and 40:08</w:t>
+        <w:t xml:space="preserve">Video: Payroll Processing Part 3 (Reconciling Timesheets) at 39:12, 39:40 and 40:08</w:t>
       </w:r>
     </w:p>
     <w:p>
@@ -1420,7 +1758,7 @@
           <w:sz w:val="18"/>
           <w:szCs w:val="18"/>
         </w:rPr>
-        <w:t xml:space="preserve">Part 3 at 40:36</w:t>
+        <w:t xml:space="preserve">Video: Payroll Processing Part 3 (Reconciling Timesheets) at 40:36</w:t>
       </w:r>
     </w:p>
     <w:p>
@@ -1450,7 +1788,7 @@
           <w:sz w:val="20"/>
           <w:szCs w:val="20"/>
         </w:rPr>
-        <w:t xml:space="preserve">The distinction comes up repeatedly during rate verification in Part 5 and causes visible confusion more than once. The percentage itself is never stated.</w:t>
+        <w:t xml:space="preserve">The distinction comes up repeatedly during rate verification in Video 5 and causes visible confusion more than once. The percentage itself is never stated.</w:t>
       </w:r>
     </w:p>
     <w:p>
@@ -1540,7 +1878,7 @@
           <w:sz w:val="18"/>
           <w:szCs w:val="18"/>
         </w:rPr>
-        <w:t xml:space="preserve">Part 3 at 27:04, and the document on screen</w:t>
+        <w:t xml:space="preserve">Video: Payroll Processing Part 3 (Reconciling Timesheets) at 27:04, and the document on screen</w:t>
       </w:r>
     </w:p>
     <w:p>
@@ -1609,7 +1947,7 @@
           <w:sz w:val="18"/>
           <w:szCs w:val="18"/>
         </w:rPr>
-        <w:t xml:space="preserve">Part 3 at 27:04</w:t>
+        <w:t xml:space="preserve">Video: Payroll Processing Part 3 (Reconciling Timesheets) at 27:04</w:t>
       </w:r>
     </w:p>
     <w:p>
@@ -1694,7 +2032,7 @@
           <w:sz w:val="18"/>
           <w:szCs w:val="18"/>
         </w:rPr>
-        <w:t xml:space="preserve">Part 3, from 54:36 to 59:44</w:t>
+        <w:t xml:space="preserve">Video: Payroll Processing Part 3 (Reconciling Timesheets), from 54:36 to 59:44</w:t>
       </w:r>
     </w:p>
     <w:p>
@@ -1763,7 +2101,7 @@
           <w:sz w:val="18"/>
           <w:szCs w:val="18"/>
         </w:rPr>
-        <w:t xml:space="preserve">Part 1, on screen at around 02:00</w:t>
+        <w:t xml:space="preserve">Video: Payroll Processing Part 1 (Payroll Prep), on screen at around 02:00</w:t>
       </w:r>
     </w:p>
     <w:p>
@@ -1814,7 +2152,7 @@
           <w:sz w:val="18"/>
           <w:szCs w:val="18"/>
         </w:rPr>
-        <w:t xml:space="preserve">Part 3 at 11:40 and 12:08, and Part 5 at 34:32</w:t>
+        <w:t xml:space="preserve">Video: Payroll Processing Part 3 (Reconciling Timesheets) at 11:40 and 12:08, and Payroll Processing Part 5 (Reconciling &amp; Balancing Payrun) at 34:32</w:t>
       </w:r>
     </w:p>
     <w:p>
@@ -1899,7 +2237,7 @@
           <w:sz w:val="18"/>
           <w:szCs w:val="18"/>
         </w:rPr>
-        <w:t xml:space="preserve">Part 1 at 00:00, and Part 2 at 00:56</w:t>
+        <w:t xml:space="preserve">Video: Payroll Processing Part 1 (Payroll Prep) at 00:00, and Payroll Processing Part 2 (Creating New Pay Run) at 00:56</w:t>
       </w:r>
     </w:p>
     <w:p>
@@ -1968,7 +2306,7 @@
           <w:sz w:val="18"/>
           <w:szCs w:val="18"/>
         </w:rPr>
-        <w:t xml:space="preserve">Part 5 at 21:00 and 22:52</w:t>
+        <w:t xml:space="preserve">Video: Payroll Processing Part 5 (Reconciling &amp; Balancing Payrun) at 21:00 and 22:52</w:t>
       </w:r>
     </w:p>
     <w:p>
@@ -2037,7 +2375,7 @@
           <w:sz w:val="18"/>
           <w:szCs w:val="18"/>
         </w:rPr>
-        <w:t xml:space="preserve">Part 6, from 02:48 to 05:36</w:t>
+        <w:t xml:space="preserve">Video: Payroll Processing Part 6 (Finalisation &amp; Bank Upload), from 02:48 to 05:36</w:t>
       </w:r>
     </w:p>
     <w:p>
@@ -2122,7 +2460,7 @@
           <w:sz w:val="18"/>
           <w:szCs w:val="18"/>
         </w:rPr>
-        <w:t xml:space="preserve">Part 5 at 22:52 and 23:20</w:t>
+        <w:t xml:space="preserve">Video: Payroll Processing Part 5 (Reconciling &amp; Balancing Payrun) at 22:52 and 23:20</w:t>
       </w:r>
     </w:p>
     <w:p>
@@ -2191,7 +2529,7 @@
           <w:sz w:val="18"/>
           <w:szCs w:val="18"/>
         </w:rPr>
-        <w:t xml:space="preserve">Part 5 at 09:20</w:t>
+        <w:t xml:space="preserve">Video: Payroll Processing Part 5 (Reconciling &amp; Balancing Payrun) at 09:20</w:t>
       </w:r>
     </w:p>
     <w:p>
@@ -2260,7 +2598,7 @@
           <w:sz w:val="18"/>
           <w:szCs w:val="18"/>
         </w:rPr>
-        <w:t xml:space="preserve">Part 5 at 00:00, and Part 3 at 27:32</w:t>
+        <w:t xml:space="preserve">Video: Payroll Processing Part 5 (Reconciling &amp; Balancing Payrun) at 00:00, and Payroll Processing Part 3 (Reconciling Timesheets) at 27:32</w:t>
       </w:r>
     </w:p>
     <w:p>

</xml_diff>

<commit_message>
Replace every em dash with ordinary punctuation
Em dashes are hard going for screen readers and for dyslexic readers, so
all 163 of them are gone from every document.

Each was replaced by what the sentence actually needed rather than swapped
blindly: a colon where what follows spells out what came before, a
semicolon between two full clauses, commas around a parenthetical, a full
stop where the dash was joining two sentences, and a plain hyphen for
speaker changes inside a quoted transcript. Headings and cross-references
take a colon; a running head that already had one takes a comma so it does
not read with two.

The builder was inserting one into every figure caption as well, so that
now uses a colon.

Verified: zero em or en dashes in the visible text of all eleven documents.

Co-Authored-By: Claude Opus 5 <noreply@anthropic.com>
Claude-Session: https://claude.ai/code/session_01NGLPCmZEnLwWWew5jbH6qG
</commit_message>
<xml_diff>
--- a/manuals/Payroll Handover - Meeting Prep.docx
+++ b/manuals/Payroll Handover - Meeting Prep.docx
@@ -14,7 +14,7 @@
           <w:sz w:val="32"/>
           <w:szCs w:val="32"/>
         </w:rPr>
-        <w:t xml:space="preserve">Meeting Prep — Where Each Question Came From</w:t>
+        <w:t xml:space="preserve">Meeting Prep: Where Each Question Came From</w:t>
       </w:r>
     </w:p>
     <w:p>
@@ -82,7 +82,7 @@
           <w:sz w:val="52"/>
           <w:szCs w:val="52"/>
         </w:rPr>
-        <w:t xml:space="preserve">Meeting Prep — Where Each Question Came From</w:t>
+        <w:t xml:space="preserve">Meeting Prep: Where Each Question Came From</w:t>
       </w:r>
     </w:p>
     <w:p>
@@ -135,7 +135,7 @@
           <w:sz w:val="22"/>
           <w:szCs w:val="22"/>
         </w:rPr>
-        <w:t xml:space="preserve">Take it into the meeting. If she asks where a question came from, you can point at the moment in her own recording rather than paraphrasing — which makes the conversation about the answer rather than about whether the question is fair.</w:t>
+        <w:t xml:space="preserve">Take it into the meeting. If she asks where a question came from, you can point at the moment in her own recording rather than paraphrasing, which makes the conversation about the answer rather than about whether the question is fair.</w:t>
       </w:r>
     </w:p>
     <w:tbl>
@@ -181,7 +181,7 @@
                 <w:sz w:val="22"/>
                 <w:szCs w:val="22"/>
               </w:rPr>
-              <w:t xml:space="preserve">These come from automatic transcription of the recordings, so occasional wording will be slightly off — 'fortnight' sometimes comes through as 'Fortnite', for instance. The timestamps are exact, so anything disputed can be checked against the video directly.</w:t>
+              <w:t xml:space="preserve">These come from automatic transcription of the recordings, so occasional wording will be slightly off: 'fortnight' sometimes comes through as 'Fortnite', for instance. The timestamps are exact, so anything disputed can be checked against the video directly.</w:t>
             </w:r>
           </w:p>
         </w:tc>
@@ -663,7 +663,7 @@
           <w:sz w:val="18"/>
           <w:szCs w:val="18"/>
         </w:rPr>
-        <w:t xml:space="preserve">Follows from question 1 — never discussed</w:t>
+        <w:t xml:space="preserve">Follows from question 1, never discussed</w:t>
       </w:r>
     </w:p>
     <w:p>
@@ -714,7 +714,7 @@
           <w:sz w:val="18"/>
           <w:szCs w:val="18"/>
         </w:rPr>
-        <w:t xml:space="preserve">General — across all six recordings</w:t>
+        <w:t xml:space="preserve">General: across all six recordings</w:t>
       </w:r>
     </w:p>
     <w:p>
@@ -850,7 +850,7 @@
           <w:sz w:val="18"/>
           <w:szCs w:val="18"/>
         </w:rPr>
-        <w:t xml:space="preserve">Follows from question 4 — never discussed</w:t>
+        <w:t xml:space="preserve">Follows from question 4, never discussed</w:t>
       </w:r>
     </w:p>
     <w:p>
@@ -919,7 +919,7 @@
           <w:sz w:val="20"/>
           <w:szCs w:val="20"/>
         </w:rPr>
-        <w:t xml:space="preserve">“Check if anything under the status Submitted is still pending — that means you can't start the payroll process yet.”</w:t>
+        <w:t xml:space="preserve">“Check if anything under the status Submitted is still pending; that means you can't start the payroll process yet.”</w:t>
       </w:r>
     </w:p>
     <w:p>
@@ -988,7 +988,7 @@
           <w:sz w:val="20"/>
           <w:szCs w:val="20"/>
         </w:rPr>
-        <w:t xml:space="preserve">“But he ticked no in the chargeable section. I think this should have been yes. — Should have been yes. — Yeah. So we'll need to add that. We'll need to let Mitch know to edit the attachment.”</w:t>
+        <w:t xml:space="preserve">“But he ticked no in the chargeable section. I think this should have been yes. - Should have been yes. - Yeah. So we'll need to add that. We'll need to let Mitch know to edit the attachment.”</w:t>
       </w:r>
     </w:p>
     <w:p>
@@ -1238,7 +1238,7 @@
           <w:sz w:val="20"/>
           <w:szCs w:val="20"/>
         </w:rPr>
-        <w:t xml:space="preserve">A resigning employee is mentioned in passing during rate verification in Video 5 — "he's the one who resigned" — but no termination is ever processed on camera.</w:t>
+        <w:t xml:space="preserve">A resigning employee is mentioned in passing during rate verification in Video 5, "he's the one who resigned", but no termination is ever processed on camera.</w:t>
       </w:r>
     </w:p>
     <w:p>
@@ -1364,7 +1364,7 @@
           <w:sz w:val="20"/>
           <w:szCs w:val="20"/>
         </w:rPr>
-        <w:t xml:space="preserve">“Charlotte Owens is a new starter, so this would not appear in the spreadsheet, so we actually need to add her in. Her rate is 45 an hour — this is the ex loading.”</w:t>
+        <w:t xml:space="preserve">“Charlotte Owens is a new starter, so this would not appear in the spreadsheet, so we actually need to add her in. Her rate is 45 an hour; this is the ex loading.”</w:t>
       </w:r>
     </w:p>
     <w:p>
@@ -1445,7 +1445,7 @@
           <w:sz w:val="20"/>
           <w:szCs w:val="20"/>
         </w:rPr>
-        <w:t xml:space="preserve">That message appears in the finalised pay run. Video 5 shows corrections being made as back pays in the following fortnight, so that appears to be the route — but it is never stated as the rule.</w:t>
+        <w:t xml:space="preserve">That message appears in the finalised pay run. Video 5 shows corrections being made as back pays in the following fortnight, so that appears to be the route, but it is never stated as the rule.</w:t>
       </w:r>
     </w:p>
     <w:p>
@@ -1650,7 +1650,7 @@
           <w:sz w:val="20"/>
           <w:szCs w:val="20"/>
         </w:rPr>
-        <w:t xml:space="preserve">This is the clearest judgement call in the recordings. She chose one, but the basis for choosing is never given — and it changes what someone gets paid.</w:t>
+        <w:t xml:space="preserve">This is the clearest judgement call in the recordings. She chose one, but the basis for choosing is never given, and it changes what someone gets paid.</w:t>
       </w:r>
     </w:p>
     <w:p>
@@ -1707,7 +1707,7 @@
           <w:sz w:val="20"/>
           <w:szCs w:val="20"/>
         </w:rPr>
-        <w:t xml:space="preserve">“The no meal break is actually at penalty times two. If I'm not mistaken, 37.5 times two. Actually, no, it's not. … 2.25 I think. … You just had a look at the award then to confirm that? Sorry, no — I calculated on my own.”</w:t>
+        <w:t xml:space="preserve">“The no meal break is actually at penalty times two. If I'm not mistaken, 37.5 times two. Actually, no, it's not. … 2.25 I think. … You just had a look at the award then to confirm that? Sorry, no, I calculated on my own.”</w:t>
       </w:r>
     </w:p>
     <w:p>
@@ -1908,7 +1908,7 @@
           <w:sz w:val="20"/>
           <w:szCs w:val="20"/>
         </w:rPr>
-        <w:t xml:space="preserve">The document itself is headed 'CTS Overtime Matrix — Full Time Staff'. Part-time staff are never discussed in relation to it.</w:t>
+        <w:t xml:space="preserve">The document itself is headed 'CTS Overtime Matrix - Full Time Staff'. Part-time staff are never discussed in relation to it.</w:t>
       </w:r>
     </w:p>
     <w:p>
@@ -2170,7 +2170,7 @@
           <w:sz w:val="20"/>
           <w:szCs w:val="20"/>
         </w:rPr>
-        <w:t xml:space="preserve">“The green denotes that the pay rate has been updated. … Okay, is that correct? Well, I actually don't know — this is the template that you created, I haven't changed it at all. … If they're green that means that we did them last week, so they should be fine.”</w:t>
+        <w:t xml:space="preserve">“The green denotes that the pay rate has been updated. … Okay, is that correct? Well, I actually don't know; this is the template that you created, I haven't changed it at all. … If they're green that means that we did them last week, so they should be fine.”</w:t>
       </w:r>
     </w:p>
     <w:p>
@@ -2478,7 +2478,7 @@
           <w:sz w:val="20"/>
           <w:szCs w:val="20"/>
         </w:rPr>
-        <w:t xml:space="preserve">“Isaac — I can't accrue it yet because we haven't issued him a letter. … So once you've issued the letter, I can always backtrace.”</w:t>
+        <w:t xml:space="preserve">“Isaac, I can't accrue it yet because we haven't issued him a letter. … So once you've issued the letter, I can always backtrace.”</w:t>
       </w:r>
     </w:p>
     <w:p>
@@ -2559,7 +2559,7 @@
           <w:sz w:val="20"/>
           <w:szCs w:val="20"/>
         </w:rPr>
-        <w:t xml:space="preserve">The recording shows the fix but not the process around it — who responds, how quickly, and whether anyone needs to approve a correction.</w:t>
+        <w:t xml:space="preserve">The recording shows the fix but not the process around it: who responds, how quickly, and whether anyone needs to approve a correction.</w:t>
       </w:r>
     </w:p>
     <w:p>
@@ -2667,7 +2667,7 @@
           <w:sz w:val="18"/>
           <w:szCs w:val="18"/>
         </w:rPr>
-        <w:t xml:space="preserve">General — the reason for asking</w:t>
+        <w:t xml:space="preserve">General: the reason for asking</w:t>
       </w:r>
     </w:p>
     <w:p>
@@ -2724,7 +2724,7 @@
           <w:sz w:val="22"/>
           <w:szCs w:val="22"/>
         </w:rPr>
-        <w:t xml:space="preserve">Question 18 — the meal break penalty rate, which was calculated rather than checked</w:t>
+        <w:t xml:space="preserve">Question 18: the meal break penalty rate, which was calculated rather than checked</w:t>
       </w:r>
     </w:p>
     <w:p>
@@ -2741,7 +2741,7 @@
           <w:sz w:val="22"/>
           <w:szCs w:val="22"/>
         </w:rPr>
-        <w:t xml:space="preserve">Question 17 — which overtime to keep when both trigger, which is a judgement call with no stated basis</w:t>
+        <w:t xml:space="preserve">Question 17: which overtime to keep when both trigger, which is a judgement call with no stated basis</w:t>
       </w:r>
     </w:p>
     <w:p>
@@ -2758,7 +2758,7 @@
           <w:sz w:val="22"/>
           <w:szCs w:val="22"/>
         </w:rPr>
-        <w:t xml:space="preserve">Question 23 — the unresolved leave without pay problem in the spreadsheet</w:t>
+        <w:t xml:space="preserve">Question 23: the unresolved leave without pay problem in the spreadsheet</w:t>
       </w:r>
     </w:p>
     <w:p>
@@ -2775,7 +2775,7 @@
           <w:sz w:val="22"/>
           <w:szCs w:val="22"/>
         </w:rPr>
-        <w:t xml:space="preserve">Questions 4 and 8 — who approves and who you escalate to when the usual people are unavailable</w:t>
+        <w:t xml:space="preserve">Questions 4 and 8: who approves and who you escalate to when the usual people are unavailable</w:t>
       </w:r>
     </w:p>
     <w:p>
@@ -2792,7 +2792,7 @@
           <w:sz w:val="22"/>
           <w:szCs w:val="22"/>
         </w:rPr>
-        <w:t xml:space="preserve">Question 10 — the Employment Hero support contact</w:t>
+        <w:t xml:space="preserve">Question 10: the Employment Hero support contact</w:t>
       </w:r>
     </w:p>
     <w:p>
@@ -2966,7 +2966,7 @@
         <w:sz w:val="16"/>
         <w:szCs w:val="16"/>
       </w:rPr>
-      <w:t xml:space="preserve">Payroll Handover — Meeting Prep</w:t>
+      <w:t xml:space="preserve">Payroll Handover: Meeting Prep</w:t>
     </w:r>
   </w:p>
 </w:hdr>

</xml_diff>